<commit_message>
Dagerous good fields added ti iem card - inprocess
</commit_message>
<xml_diff>
--- a/src/Layouts/Customer.docx
+++ b/src/Layouts/Customer.docx
@@ -6921,6 +6921,126 @@
  
          < / T o o l t i p >   
+         < T o o l t i p   c o l u m n = " P r o d u c t _ N o _ "   E l e m e n t I d = " 1 5 1 4 1 3 7 6 3 3 " > + 
+             < T o o l t i p T e x t   l a n g = " e n - U S " > S p e c i f i e s   t h e   i d e n t i f i e r   o f   t h e   p r o d u c t .   I f   n o   p r o d u c t   i s   s e l e c t e d ,   t h e   p r i c e   a n d   d i s c o u n t   v a l u e s   w i l l   a p p l y   t o   a l l   p r o d u c t s   o f   t h e   s e l e c t e d   p r o d u c t   t y p e   f o r   w h i c h   t h o s e   v a l u e s   a r e   n o t   s p e c i f i e d .   F o r   e x a m p l e ,   i f   y o u   c h o o s e   I t e m   a s   t h e   p r o d u c t   t y p e   b u t   d o   n o t   s p e c i f y   a   s p e c i f i c   i t e m ,   t h e   p r i c e   w i l l   a p p l y   t o   a l l   i t e m s   f o r   w h i c h   a   p r i c e   i s   n o t   s p e c i f i e d . < / T o o l t i p T e x t > + 
+         < / T o o l t i p > + 
+         < T o o l t i p   c o l u m n = " D e s c r i p t i o n "   E l e m e n t I d = " 1 3 1 4 3 5 1 3 0 7 " > + 
+             < T o o l t i p T e x t   l a n g = " e n - U S " > S p e c i f i e s   t h e   d e s c r i p t i o n   o f   t h e   p r o d u c t . < / T o o l t i p T e x t > + 
+         < / T o o l t i p > + 
+         < T o o l t i p   c o l u m n = " U n i t _ P r i c e "   E l e m e n t I d = " 1 9 6 2 8 6 0 0 3 3 " > + 
+             < T o o l t i p T e x t   l a n g = " e n - U S " > S p e c i f i e s   t h e   u n i t   p r i c e   o f   t h e   p r o d u c t . < / T o o l t i p T e x t > + 
+         < / T o o l t i p > + 
+         < T o o l t i p   c o l u m n = " M i n i m u m _ Q u a n t i t y "   E l e m e n t I d = " 1 2 0 6 0 3 2 0 1 " > + 
+             < T o o l t i p T e x t   l a n g = " e n - U S " > S p e c i f i e s   t h e   m i n i m u m   q u a n t i t y   o f   t h e   p r o d u c t . < / T o o l t i p T e x t > + 
+         < / T o o l t i p > + 
+         < T o o l t i p   c o l u m n = " D o c u m e n t _ N o _ "   E l e m e n t I d = " 1 0 1 7 4 9 9 4 7 " > + 
+             < T o o l t i p T e x t   l a n g = " e n - U S " > S p e c i f i e s   t h e   d o c u m e n t   n u m b e r . < / T o o l t i p T e x t > + 
+         < / T o o l t i p > + 
+         < T o o l t i p   c o l u m n = " I t e m _ N o _ "   E l e m e n t I d = " 6 5 1 9 9 5 7 2 9 " > + 
+             < T o o l t i p T e x t   l a n g = " e n - U S " > S p e c i f i e s   t h e   n u m b e r   o f   t h e   i n v o l v e d   e n t r y   o r   r e c o r d ,   a c c o r d i n g   t o   t h e   s p e c i f i e d   n u m b e r   s e r i e s . < / T o o l t i p T e x t > + 
+         < / T o o l t i p > + 
+         < T o o l t i p   c o l u m n = " D e s c r i p t i o n _ i t e m "   E l e m e n t I d = " 9 7 4 1 4 8 6 6 5 " > + 
+             < T o o l t i p T e x t   l a n g = " e n - U S " > S p e c i f i e s   t h e   n a m e   o f   t h e   i t e m   o r   g e n e r a l   l e d g e r   a c c o u n t ,   o r   s o m e   d e s c r i p t i v e   t e x t . < / T o o l t i p T e x t > + 
+         < / T o o l t i p > + 
+         < T o o l t i p   c o l u m n = " Q u a n t i t y "   E l e m e n t I d = " 5 5 6 9 2 0 8 8 6 " > + 
+             < T o o l t i p T e x t   l a n g = " e n - U S " > S p e c i f i e s   t h e   n u m b e r   o f   u n i t s   o f   t h e   i t e m   s p e c i f i e d   o n   t h e   l i n e . < / T o o l t i p T e x t > + 
+         < / T o o l t i p > + 
+         < T o o l t i p   c o l u m n = " U n i t P r i c e "   E l e m e n t I d = " 1 4 7 8 2 2 1 5 2 6 " > + 
+             < T o o l t i p T e x t   l a n g = " e n - U S " > S p e c i f i e s   t h e   p r i c e   o f   o n e   u n i t   o f   t h e   i t e m   o r   r e s o u r c e .   Y o u   c a n   e n t e r   a   p r i c e   m a n u a l l y   o r   h a v e   i t   e n t e r e d   a c c o r d i n g   t o   t h e   P r i c e / P r o f i t   C a l c u l a t i o n   f i e l d   o n   t h e   r e l a t e d   c a r d . < / T o o l t i p T e x t > + 
+         < / T o o l t i p > + 
+         < T o o l t i p   c o l u m n = " D o c u m e n t _ N o _ 2 "   E l e m e n t I d = " 4 9 2 2 9 2 5 5 9 " > + 
+             < T o o l t i p T e x t   l a n g = " e n - U S " > S p e c i f i e s   t h e   d o c u m e n t   n u m b e r . < / T o o l t i p T e x t > + 
+         < / T o o l t i p > + 
+         < T o o l t i p   c o l u m n = " I t e m _ N o _ 2 "   E l e m e n t I d = " 5 4 4 9 3 6 0 9 1 " > + 
+             < T o o l t i p T e x t   l a n g = " e n - U S " > S p e c i f i e s   t h e   n u m b e r   o f   t h e   i n v o l v e d   e n t r y   o r   r e c o r d ,   a c c o r d i n g   t o   t h e   s p e c i f i e d   n u m b e r   s e r i e s . < / T o o l t i p T e x t > + 
+         < / T o o l t i p > + 
+         < T o o l t i p   c o l u m n = " D e s c r i p t i o n _ i t e m 2 "   E l e m e n t I d = " 4 8 9 3 1 0 5 8 9 " > + 
+             < T o o l t i p T e x t   l a n g = " e n - U S " > S p e c i f i e s   t h e   n a m e   o f   t h e   i t e m   o r   g e n e r a l   l e d g e r   a c c o u n t ,   o r   s o m e   d e s c r i p t i v e   t e x t . < / T o o l t i p T e x t > + 
+         < / T o o l t i p > + 
+         < T o o l t i p   c o l u m n = " Q u a n t i t y 2 "   E l e m e n t I d = " 5 0 5 0 6 3 0 0 4 " > + 
+             < T o o l t i p T e x t   l a n g = " e n - U S " > S p e c i f i e s   t h e   n u m b e r   o f   u n i t s   o f   t h e   i t e m   s p e c i f i e d   o n   t h e   l i n e . < / T o o l t i p T e x t > + 
+         < / T o o l t i p > + 
+         < T o o l t i p   c o l u m n = " U n i t P r i c e 2 "   E l e m e n t I d = " 2 4 0 5 6 7 0 8 " > + 
+             < T o o l t i p T e x t   l a n g = " e n - U S " > S p e c i f i e s   t h e   p r i c e   o f   o n e   u n i t   o f   t h e   i t e m   o r   r e s o u r c e .   Y o u   c a n   e n t e r   a   p r i c e   m a n u a l l y   o r   h a v e   i t   e n t e r e d   a c c o r d i n g   t o   t h e   P r i c e / P r o f i t   C a l c u l a t i o n   f i e l d   o n   t h e   r e l a t e d   c a r d . < / T o o l t i p T e x t > + 
+         < / T o o l t i p > + 
+         < T o o l t i p   c o l u m n = " L i n e _ A m o u n t "   E l e m e n t I d = " 1 6 1 7 1 7 1 8 0 0 " > + 
+             < T o o l t i p T e x t   l a n g = " e n - U S " > S p e c i f i e s   t h e   n e t   a m o u n t ,   e x c l u d i n g   a n y   i n v o i c e   d i s c o u n t   a m o u n t ,   t h a t   m u s t   b e   p a i d   f o r   p r o d u c t s   o n   t h e   l i n e . < / T o o l t i p T e x t > + 
+         < / T o o l t i p > + 
+         < T o o l t i p   c o l u m n = " D o c u m e n t _ N o _ 3 "   E l e m e n t I d = " 1 1 2 9 9 8 9 1 7 6 " > + 
+             < T o o l t i p T e x t   l a n g = " e n - U S " > S p e c i f i e s   t h e   d o c u m e n t   n u m b e r . < / T o o l t i p T e x t > + 
+         < / T o o l t i p > + 
+         < T o o l t i p   c o l u m n = " I t e m _ N o _ 3 "   E l e m e n t I d = " 9 2 7 6 0 5 2 6 " > + 
+             < T o o l t i p T e x t   l a n g = " e n - U S " > S p e c i f i e s   t h e   n u m b e r   o f   t h e   i n v o l v e d   e n t r y   o r   r e c o r d ,   a c c o r d i n g   t o   t h e   s p e c i f i e d   n u m b e r   s e r i e s . < / T o o l t i p T e x t > + 
+         < / T o o l t i p > + 
+         < T o o l t i p   c o l u m n = " D e s c r i p t i o n _ i t e m 3 "   E l e m e n t I d = " 1 1 2 7 0 0 7 2 0 6 " > + 
+             < T o o l t i p T e x t   l a n g = " e n - U S " > S p e c i f i e s   t h e   n a m e   o f   t h e   i t e m   o r   g e n e r a l   l e d g e r   a c c o u n t ,   o r   s o m e   d e s c r i p t i v e   t e x t . < / T o o l t i p T e x t > + 
+         < / T o o l t i p > + 
+         < T o o l t i p   c o l u m n = " Q u a n t i t y 3 "   E l e m e n t I d = " 1 3 2 6 3 3 6 1 3 " > + 
+             < T o o l t i p T e x t   l a n g = " e n - U S " > S p e c i f i e s   t h e   n u m b e r   o f   u n i t s   o f   t h e   i t e m   s p e c i f i e d   o n   t h e   l i n e . < / T o o l t i p T e x t > + 
+         < / T o o l t i p > + 
+         < T o o l t i p   c o l u m n = " U n i t P r i c e 3 "   E l e m e n t I d = " 6 6 1 7 5 3 3 2 5 " > + 
+             < T o o l t i p T e x t   l a n g = " e n - U S " > S p e c i f i e s   t h e   p r i c e   o f   o n e   u n i t   o f   t h e   i t e m   o r   r e s o u r c e .   Y o u   c a n   e n t e r   a   p r i c e   m a n u a l l y   o r   h a v e   i t   e n t e r e d   a c c o r d i n g   t o   t h e   P r i c e / P r o f i t   C a l c u l a t i o n   f i e l d   o n   t h e   r e l a t e d   c a r d . < / T o o l t i p T e x t > + 
+         < / T o o l t i p > + 
      < / T o o l t i p s >   
      < C u s t o m e r   E l e m e n t T y p e = " D a t a I t e m "   E l e m e n t I d = " 1 5 2 5 1 9 1 9 9 " > 
</xml_diff>

<commit_message>
last appointment date added to CRM accounts successfully
</commit_message>
<xml_diff>
--- a/src/Layouts/Customer.docx
+++ b/src/Layouts/Customer.docx
@@ -219,6 +219,126 @@
  
          < / T o o l t i p >   
+         < T o o l t i p   c o l u m n = " P r o d u c t _ N o _ "   E l e m e n t I d = " 1 5 1 4 1 3 7 6 3 3 " > + 
+             < T o o l t i p T e x t   l a n g = " e n - U S " > S p e c i f i e s   t h e   i d e n t i f i e r   o f   t h e   p r o d u c t .   I f   n o   p r o d u c t   i s   s e l e c t e d ,   t h e   p r i c e   a n d   d i s c o u n t   v a l u e s   w i l l   a p p l y   t o   a l l   p r o d u c t s   o f   t h e   s e l e c t e d   p r o d u c t   t y p e   f o r   w h i c h   t h o s e   v a l u e s   a r e   n o t   s p e c i f i e d .   F o r   e x a m p l e ,   i f   y o u   c h o o s e   I t e m   a s   t h e   p r o d u c t   t y p e   b u t   d o   n o t   s p e c i f y   a   s p e c i f i c   i t e m ,   t h e   p r i c e   w i l l   a p p l y   t o   a l l   i t e m s   f o r   w h i c h   a   p r i c e   i s   n o t   s p e c i f i e d . < / T o o l t i p T e x t > + 
+         < / T o o l t i p > + 
+         < T o o l t i p   c o l u m n = " D e s c r i p t i o n "   E l e m e n t I d = " 1 3 1 4 3 5 1 3 0 7 " > + 
+             < T o o l t i p T e x t   l a n g = " e n - U S " > S p e c i f i e s   t h e   d e s c r i p t i o n   o f   t h e   p r o d u c t . < / T o o l t i p T e x t > + 
+         < / T o o l t i p > + 
+         < T o o l t i p   c o l u m n = " U n i t _ P r i c e "   E l e m e n t I d = " 1 9 6 2 8 6 0 0 3 3 " > + 
+             < T o o l t i p T e x t   l a n g = " e n - U S " > S p e c i f i e s   t h e   u n i t   p r i c e   o f   t h e   p r o d u c t . < / T o o l t i p T e x t > + 
+         < / T o o l t i p > + 
+         < T o o l t i p   c o l u m n = " M i n i m u m _ Q u a n t i t y "   E l e m e n t I d = " 1 2 0 6 0 3 2 0 1 " > + 
+             < T o o l t i p T e x t   l a n g = " e n - U S " > S p e c i f i e s   t h e   m i n i m u m   q u a n t i t y   o f   t h e   p r o d u c t . < / T o o l t i p T e x t > + 
+         < / T o o l t i p > + 
+         < T o o l t i p   c o l u m n = " D o c u m e n t _ N o _ "   E l e m e n t I d = " 1 0 1 7 4 9 9 4 7 " > + 
+             < T o o l t i p T e x t   l a n g = " e n - U S " > S p e c i f i e s   t h e   d o c u m e n t   n u m b e r . < / T o o l t i p T e x t > + 
+         < / T o o l t i p > + 
+         < T o o l t i p   c o l u m n = " I t e m _ N o _ "   E l e m e n t I d = " 6 5 1 9 9 5 7 2 9 " > + 
+             < T o o l t i p T e x t   l a n g = " e n - U S " > S p e c i f i e s   t h e   n u m b e r   o f   t h e   i n v o l v e d   e n t r y   o r   r e c o r d ,   a c c o r d i n g   t o   t h e   s p e c i f i e d   n u m b e r   s e r i e s . < / T o o l t i p T e x t > + 
+         < / T o o l t i p > + 
+         < T o o l t i p   c o l u m n = " D e s c r i p t i o n _ i t e m "   E l e m e n t I d = " 9 7 4 1 4 8 6 6 5 " > + 
+             < T o o l t i p T e x t   l a n g = " e n - U S " > S p e c i f i e s   t h e   n a m e   o f   t h e   i t e m   o r   g e n e r a l   l e d g e r   a c c o u n t ,   o r   s o m e   d e s c r i p t i v e   t e x t . < / T o o l t i p T e x t > + 
+         < / T o o l t i p > + 
+         < T o o l t i p   c o l u m n = " Q u a n t i t y "   E l e m e n t I d = " 5 5 6 9 2 0 8 8 6 " > + 
+             < T o o l t i p T e x t   l a n g = " e n - U S " > S p e c i f i e s   t h e   n u m b e r   o f   u n i t s   o f   t h e   i t e m   s p e c i f i e d   o n   t h e   l i n e . < / T o o l t i p T e x t > + 
+         < / T o o l t i p > + 
+         < T o o l t i p   c o l u m n = " U n i t P r i c e "   E l e m e n t I d = " 1 4 7 8 2 2 1 5 2 6 " > + 
+             < T o o l t i p T e x t   l a n g = " e n - U S " > S p e c i f i e s   t h e   p r i c e   o f   o n e   u n i t   o f   t h e   i t e m   o r   r e s o u r c e .   Y o u   c a n   e n t e r   a   p r i c e   m a n u a l l y   o r   h a v e   i t   e n t e r e d   a c c o r d i n g   t o   t h e   P r i c e / P r o f i t   C a l c u l a t i o n   f i e l d   o n   t h e   r e l a t e d   c a r d . < / T o o l t i p T e x t > + 
+         < / T o o l t i p > + 
+         < T o o l t i p   c o l u m n = " D o c u m e n t _ N o _ 2 "   E l e m e n t I d = " 4 9 2 2 9 2 5 5 9 " > + 
+             < T o o l t i p T e x t   l a n g = " e n - U S " > S p e c i f i e s   t h e   d o c u m e n t   n u m b e r . < / T o o l t i p T e x t > + 
+         < / T o o l t i p > + 
+         < T o o l t i p   c o l u m n = " I t e m _ N o _ 2 "   E l e m e n t I d = " 5 4 4 9 3 6 0 9 1 " > + 
+             < T o o l t i p T e x t   l a n g = " e n - U S " > S p e c i f i e s   t h e   n u m b e r   o f   t h e   i n v o l v e d   e n t r y   o r   r e c o r d ,   a c c o r d i n g   t o   t h e   s p e c i f i e d   n u m b e r   s e r i e s . < / T o o l t i p T e x t > + 
+         < / T o o l t i p > + 
+         < T o o l t i p   c o l u m n = " D e s c r i p t i o n _ i t e m 2 "   E l e m e n t I d = " 4 8 9 3 1 0 5 8 9 " > + 
+             < T o o l t i p T e x t   l a n g = " e n - U S " > S p e c i f i e s   t h e   n a m e   o f   t h e   i t e m   o r   g e n e r a l   l e d g e r   a c c o u n t ,   o r   s o m e   d e s c r i p t i v e   t e x t . < / T o o l t i p T e x t > + 
+         < / T o o l t i p > + 
+         < T o o l t i p   c o l u m n = " Q u a n t i t y 2 "   E l e m e n t I d = " 5 0 5 0 6 3 0 0 4 " > + 
+             < T o o l t i p T e x t   l a n g = " e n - U S " > S p e c i f i e s   t h e   n u m b e r   o f   u n i t s   o f   t h e   i t e m   s p e c i f i e d   o n   t h e   l i n e . < / T o o l t i p T e x t > + 
+         < / T o o l t i p > + 
+         < T o o l t i p   c o l u m n = " U n i t P r i c e 2 "   E l e m e n t I d = " 2 4 0 5 6 7 0 8 " > + 
+             < T o o l t i p T e x t   l a n g = " e n - U S " > S p e c i f i e s   t h e   p r i c e   o f   o n e   u n i t   o f   t h e   i t e m   o r   r e s o u r c e .   Y o u   c a n   e n t e r   a   p r i c e   m a n u a l l y   o r   h a v e   i t   e n t e r e d   a c c o r d i n g   t o   t h e   P r i c e / P r o f i t   C a l c u l a t i o n   f i e l d   o n   t h e   r e l a t e d   c a r d . < / T o o l t i p T e x t > + 
+         < / T o o l t i p > + 
+         < T o o l t i p   c o l u m n = " L i n e _ A m o u n t "   E l e m e n t I d = " 1 6 1 7 1 7 1 8 0 0 " > + 
+             < T o o l t i p T e x t   l a n g = " e n - U S " > S p e c i f i e s   t h e   n e t   a m o u n t ,   e x c l u d i n g   a n y   i n v o i c e   d i s c o u n t   a m o u n t ,   t h a t   m u s t   b e   p a i d   f o r   p r o d u c t s   o n   t h e   l i n e . < / T o o l t i p T e x t > + 
+         < / T o o l t i p > + 
+         < T o o l t i p   c o l u m n = " D o c u m e n t _ N o _ 3 "   E l e m e n t I d = " 1 1 2 9 9 8 9 1 7 6 " > + 
+             < T o o l t i p T e x t   l a n g = " e n - U S " > S p e c i f i e s   t h e   d o c u m e n t   n u m b e r . < / T o o l t i p T e x t > + 
+         < / T o o l t i p > + 
+         < T o o l t i p   c o l u m n = " I t e m _ N o _ 3 "   E l e m e n t I d = " 9 2 7 6 0 5 2 6 " > + 
+             < T o o l t i p T e x t   l a n g = " e n - U S " > S p e c i f i e s   t h e   n u m b e r   o f   t h e   i n v o l v e d   e n t r y   o r   r e c o r d ,   a c c o r d i n g   t o   t h e   s p e c i f i e d   n u m b e r   s e r i e s . < / T o o l t i p T e x t > + 
+         < / T o o l t i p > + 
+         < T o o l t i p   c o l u m n = " D e s c r i p t i o n _ i t e m 3 "   E l e m e n t I d = " 1 1 2 7 0 0 7 2 0 6 " > + 
+             < T o o l t i p T e x t   l a n g = " e n - U S " > S p e c i f i e s   t h e   n a m e   o f   t h e   i t e m   o r   g e n e r a l   l e d g e r   a c c o u n t ,   o r   s o m e   d e s c r i p t i v e   t e x t . < / T o o l t i p T e x t > + 
+         < / T o o l t i p > + 
+         < T o o l t i p   c o l u m n = " Q u a n t i t y 3 "   E l e m e n t I d = " 1 3 2 6 3 3 6 1 3 " > + 
+             < T o o l t i p T e x t   l a n g = " e n - U S " > S p e c i f i e s   t h e   n u m b e r   o f   u n i t s   o f   t h e   i t e m   s p e c i f i e d   o n   t h e   l i n e . < / T o o l t i p T e x t > + 
+         < / T o o l t i p > + 
+         < T o o l t i p   c o l u m n = " U n i t P r i c e 3 "   E l e m e n t I d = " 6 6 1 7 5 3 3 2 5 " > + 
+             < T o o l t i p T e x t   l a n g = " e n - U S " > S p e c i f i e s   t h e   p r i c e   o f   o n e   u n i t   o f   t h e   i t e m   o r   r e s o u r c e .   Y o u   c a n   e n t e r   a   p r i c e   m a n u a l l y   o r   h a v e   i t   e n t e r e d   a c c o r d i n g   t o   t h e   P r i c e / P r o f i t   C a l c u l a t i o n   f i e l d   o n   t h e   r e l a t e d   c a r d . < / T o o l t i p T e x t > + 
+         < / T o o l t i p > + 
      < / T o o l t i p s >   
      < C u s t o m e r   E l e m e n t T y p e = " D a t a I t e m "   E l e m e n t I d = " 1 5 2 5 1 9 1 9 9 " > 
</xml_diff>